<commit_message>
fix: update website name to 'スパサポ！' and update templates
</commit_message>
<xml_diff>
--- a/public/templates/nda.docx
+++ b/public/templates/nda.docx
@@ -685,7 +685,19 @@
         <w:rPr>
           <w:rFonts w:ascii="BIZ UDP明朝 Medium" w:eastAsia="BIZ UDP明朝 Medium" w:hAnsi="BIZ UDP明朝 Medium" w:hint="eastAsia"/>
         </w:rPr>
-        <w:t>被開示者は、個人情報保護の観点から本契約中の他の条項に定める規定に従うほか、「個人情報の保護に関する法律」（平成15年法律第57号）の趣旨に従い、不正アクセス、使用、複製、開示、漏洩、改変および消去に関する記録を作成し、開示者からの要求があった場合には、当該記録を速やかに提出し、報告を行うものとする。なお、当該切り奥は本契約終了後、5年間保管するものとする。</w:t>
+        <w:t>被開示者は、個人情報保護の観点から本契約中の他の条項に定める規定に従うほか、「個人情報の保護に関する法律」（平成15年法律第57号）の趣旨に従い、不正アクセス、使用、複製、開示、漏洩、改変および消去に関する記録を作成し、開示者からの要求があった場合には、当該記録を速やかに提出し、報告を行うものとする。なお、当該</w:t>
+      </w:r>
+      <w:r>
+        <w:rPr>
+          <w:rFonts w:ascii="BIZ UDP明朝 Medium" w:eastAsia="BIZ UDP明朝 Medium" w:hAnsi="BIZ UDP明朝 Medium" w:hint="eastAsia"/>
+        </w:rPr>
+        <w:t>記録</w:t>
+      </w:r>
+      <w:r>
+        <w:rPr>
+          <w:rFonts w:ascii="BIZ UDP明朝 Medium" w:eastAsia="BIZ UDP明朝 Medium" w:hAnsi="BIZ UDP明朝 Medium" w:hint="eastAsia"/>
+        </w:rPr>
+        <w:t>は本契約終了後、5年間保管するものとする。</w:t>
       </w:r>
     </w:p>
     <w:p>

</xml_diff>